<commit_message>
Updated content for better content
</commit_message>
<xml_diff>
--- a/Travel America/deep-code-review-2026.docx
+++ b/Travel America/deep-code-review-2026.docx
@@ -10074,6 +10074,827 @@
         </w:pBdr>
         <w:spacing w:after="160" w:before="160"/>
       </w:pPr>
+    </w:p>
+    <w:p>
+      <w:pPr>
+        <w:pStyle w:val="Heading1"/>
+        <w:pageBreakBefore/>
+      </w:pPr>
+      <w:r>
+        <w:t>6. Component Duplication Beyond Booking Code</w:t>
+      </w:r>
+    </w:p>
+    <w:p>
+      <w:pPr>
+        <w:pStyle w:val="Heading2"/>
+      </w:pPr>
+      <w:r>
+        <w:t>6.1 Hero, FAQ, and ScenarioCard Reinvention</w:t>
+      </w:r>
+    </w:p>
+    <w:p>
+      <w:pPr>
+        <w:spacing w:after="120" w:before="60"/>
+      </w:pPr>
+      <w:r>
+        <w:rPr>
+          <w:rFonts w:ascii="Arial" w:cs="Arial" w:eastAsia="Arial" w:hAnsi="Arial"/>
+          <w:sz w:val="22"/>
+          <w:szCs w:val="22"/>
+        </w:rPr>
+        <w:t xml:space="preserve">Section 2.1 covers the 4x booking client duplication. A separate but equally significant problem is that three core UI primitives have been reimplemented independently in each page folder rather than using the shared components in app/components/destination/.</w:t>
+      </w:r>
+    </w:p>
+    <w:p>
+      <w:pPr>
+        <w:spacing w:after="80" w:before="80"/>
+      </w:pPr>
+      <w:r>
+        <w:rPr>
+          <w:rFonts w:ascii="Arial" w:cs="Arial" w:eastAsia="Arial" w:hAnsi="Arial"/>
+          <w:b/>
+          <w:sz w:val="22"/>
+          <w:szCs w:val="22"/>
+        </w:rPr>
+        <w:t>Hero component — 6 implementations:</w:t>
+      </w:r>
+    </w:p>
+    <w:p>
+      <w:pPr>
+        <w:spacing w:after="40" w:before="40"/>
+        <w:ind w:left="360"/>
+      </w:pPr>
+      <w:r>
+        <w:rPr>
+          <w:rFonts w:ascii="Courier New" w:cs="Courier New" w:hAnsi="Courier New"/>
+          <w:sz w:val="18"/>
+          <w:szCs w:val="18"/>
+          <w:color w:val="444444"/>
+        </w:rPr>
+        <w:t>destination/nyc/components/Hero/HeroSection.tsx</w:t>
+      </w:r>
+    </w:p>
+    <w:p>
+      <w:pPr>
+        <w:spacing w:after="40" w:before="40"/>
+        <w:ind w:left="360"/>
+      </w:pPr>
+      <w:r>
+        <w:rPr>
+          <w:rFonts w:ascii="Courier New" w:cs="Courier New" w:hAnsi="Courier New"/>
+          <w:sz w:val="18"/>
+          <w:szCs w:val="18"/>
+          <w:color w:val="444444"/>
+        </w:rPr>
+        <w:t>destination/nyc/is-nyc-safe-at-night/components/hero/hero.tsx</w:t>
+      </w:r>
+    </w:p>
+    <w:p>
+      <w:pPr>
+        <w:spacing w:after="40" w:before="40"/>
+        <w:ind w:left="360"/>
+      </w:pPr>
+      <w:r>
+        <w:rPr>
+          <w:rFonts w:ascii="Courier New" w:cs="Courier New" w:hAnsi="Courier New"/>
+          <w:sz w:val="18"/>
+          <w:szCs w:val="18"/>
+          <w:color w:val="444444"/>
+        </w:rPr>
+        <w:t>destination/nyc/nyc-female-solo-travel-guide/components/Hero/herobanner.tsx</w:t>
+      </w:r>
+    </w:p>
+    <w:p>
+      <w:pPr>
+        <w:spacing w:after="40" w:before="40"/>
+        <w:ind w:left="360"/>
+      </w:pPr>
+      <w:r>
+        <w:rPr>
+          <w:rFonts w:ascii="Courier New" w:cs="Courier New" w:hAnsi="Courier New"/>
+          <w:sz w:val="18"/>
+          <w:szCs w:val="18"/>
+          <w:color w:val="444444"/>
+        </w:rPr>
+        <w:t>destination/nyc/nyc-safety-guide/components/herobanner/safetyhero.tsx</w:t>
+      </w:r>
+    </w:p>
+    <w:p>
+      <w:pPr>
+        <w:spacing w:after="40" w:before="40"/>
+        <w:ind w:left="360"/>
+      </w:pPr>
+      <w:r>
+        <w:rPr>
+          <w:rFonts w:ascii="Courier New" w:cs="Courier New" w:hAnsi="Courier New"/>
+          <w:sz w:val="18"/>
+          <w:szCs w:val="18"/>
+          <w:color w:val="444444"/>
+        </w:rPr>
+        <w:t>destination/nyc/nyc-subway-map/components/herobanner/herobanner.tsx</w:t>
+      </w:r>
+    </w:p>
+    <w:p>
+      <w:pPr>
+        <w:spacing w:after="80" w:before="40"/>
+        <w:ind w:left="360"/>
+      </w:pPr>
+      <w:r>
+        <w:rPr>
+          <w:rFonts w:ascii="Courier New" w:cs="Courier New" w:hAnsi="Courier New"/>
+          <w:sz w:val="18"/>
+          <w:szCs w:val="18"/>
+          <w:color w:val="444444"/>
+        </w:rPr>
+        <w:t>destination/nyc/subway-safety-guide/components/Hero/Hero.tsx</w:t>
+      </w:r>
+    </w:p>
+    <w:p>
+      <w:pPr>
+        <w:spacing w:after="80" w:before="80"/>
+      </w:pPr>
+      <w:r>
+        <w:rPr>
+          <w:rFonts w:ascii="Arial" w:cs="Arial" w:eastAsia="Arial" w:hAnsi="Arial"/>
+          <w:b/>
+          <w:sz w:val="22"/>
+          <w:szCs w:val="22"/>
+        </w:rPr>
+        <w:t>FAQ Accordion — 5 implementations (note: “FAQAccordian” typo in some folder names):</w:t>
+      </w:r>
+    </w:p>
+    <w:p>
+      <w:pPr>
+        <w:spacing w:after="40" w:before="40"/>
+        <w:ind w:left="360"/>
+      </w:pPr>
+      <w:r>
+        <w:rPr>
+          <w:rFonts w:ascii="Courier New" w:cs="Courier New" w:hAnsi="Courier New"/>
+          <w:sz w:val="18"/>
+          <w:szCs w:val="18"/>
+          <w:color w:val="444444"/>
+        </w:rPr>
+        <w:t>app/components/destination/faqsection/faqsection.tsx (shared — use this)</w:t>
+      </w:r>
+    </w:p>
+    <w:p>
+      <w:pPr>
+        <w:spacing w:after="40" w:before="40"/>
+        <w:ind w:left="360"/>
+      </w:pPr>
+      <w:r>
+        <w:rPr>
+          <w:rFonts w:ascii="Courier New" w:cs="Courier New" w:hAnsi="Courier New"/>
+          <w:sz w:val="18"/>
+          <w:szCs w:val="18"/>
+          <w:color w:val="444444"/>
+        </w:rPr>
+        <w:t>app/components/faq/faq.tsx (grouped-object variant, also shared)</w:t>
+      </w:r>
+    </w:p>
+    <w:p>
+      <w:pPr>
+        <w:spacing w:after="40" w:before="40"/>
+        <w:ind w:left="360"/>
+      </w:pPr>
+      <w:r>
+        <w:rPr>
+          <w:rFonts w:ascii="Courier New" w:cs="Courier New" w:hAnsi="Courier New"/>
+          <w:sz w:val="18"/>
+          <w:szCs w:val="18"/>
+          <w:color w:val="444444"/>
+        </w:rPr>
+        <w:t>destination/nyc/is-nyc-safe-at-night/components/FAQAccordion/</w:t>
+      </w:r>
+    </w:p>
+    <w:p>
+      <w:pPr>
+        <w:spacing w:after="40" w:before="40"/>
+        <w:ind w:left="360"/>
+      </w:pPr>
+      <w:r>
+        <w:rPr>
+          <w:rFonts w:ascii="Courier New" w:cs="Courier New" w:hAnsi="Courier New"/>
+          <w:sz w:val="18"/>
+          <w:szCs w:val="18"/>
+          <w:color w:val="444444"/>
+        </w:rPr>
+        <w:t>destination/nyc/nyc-safety-guide/components/FAQAccordian/ (typo)</w:t>
+      </w:r>
+    </w:p>
+    <w:p>
+      <w:pPr>
+        <w:spacing w:after="80" w:before="40"/>
+        <w:ind w:left="360"/>
+      </w:pPr>
+      <w:r>
+        <w:rPr>
+          <w:rFonts w:ascii="Courier New" w:cs="Courier New" w:hAnsi="Courier New"/>
+          <w:sz w:val="18"/>
+          <w:szCs w:val="18"/>
+          <w:color w:val="444444"/>
+        </w:rPr>
+        <w:t>destination/nyc/nyc-female-solo-travel-guide/components/FAQAccordian/ (typo)</w:t>
+      </w:r>
+    </w:p>
+    <w:p>
+      <w:pPr>
+        <w:spacing w:after="80" w:before="80"/>
+      </w:pPr>
+      <w:r>
+        <w:rPr>
+          <w:rFonts w:ascii="Arial" w:cs="Arial" w:eastAsia="Arial" w:hAnsi="Arial"/>
+          <w:b/>
+          <w:sz w:val="22"/>
+          <w:szCs w:val="22"/>
+        </w:rPr>
+        <w:t>ScenarioCard — 4 implementations:</w:t>
+      </w:r>
+    </w:p>
+    <w:p>
+      <w:pPr>
+        <w:spacing w:after="40" w:before="40"/>
+        <w:ind w:left="360"/>
+      </w:pPr>
+      <w:r>
+        <w:rPr>
+          <w:rFonts w:ascii="Courier New" w:cs="Courier New" w:hAnsi="Courier New"/>
+          <w:sz w:val="18"/>
+          <w:szCs w:val="18"/>
+          <w:color w:val="444444"/>
+        </w:rPr>
+        <w:t>app/components/destination/scenariocard/scenariocard.tsx (shared — underused)</w:t>
+      </w:r>
+    </w:p>
+    <w:p>
+      <w:pPr>
+        <w:spacing w:after="40" w:before="40"/>
+        <w:ind w:left="360"/>
+      </w:pPr>
+      <w:r>
+        <w:rPr>
+          <w:rFonts w:ascii="Courier New" w:cs="Courier New" w:hAnsi="Courier New"/>
+          <w:sz w:val="18"/>
+          <w:szCs w:val="18"/>
+          <w:color w:val="444444"/>
+        </w:rPr>
+        <w:t>destination/nyc/is-nyc-safe-at-night/components/ScenarioCards/</w:t>
+      </w:r>
+    </w:p>
+    <w:p>
+      <w:pPr>
+        <w:spacing w:after="40" w:before="40"/>
+        <w:ind w:left="360"/>
+      </w:pPr>
+      <w:r>
+        <w:rPr>
+          <w:rFonts w:ascii="Courier New" w:cs="Courier New" w:hAnsi="Courier New"/>
+          <w:sz w:val="18"/>
+          <w:szCs w:val="18"/>
+          <w:color w:val="444444"/>
+        </w:rPr>
+        <w:t>destination/nyc/nyc-female-solo-travel-guide/components/scenariosection/</w:t>
+      </w:r>
+    </w:p>
+    <w:p>
+      <w:pPr>
+        <w:spacing w:after="80" w:before="40"/>
+        <w:ind w:left="360"/>
+      </w:pPr>
+      <w:r>
+        <w:rPr>
+          <w:rFonts w:ascii="Courier New" w:cs="Courier New" w:hAnsi="Courier New"/>
+          <w:sz w:val="18"/>
+          <w:szCs w:val="18"/>
+          <w:color w:val="444444"/>
+        </w:rPr>
+        <w:t>destination/nyc/nyc-safety-guide/components/scenariosection/</w:t>
+      </w:r>
+    </w:p>
+    <w:p>
+      <w:pPr>
+        <w:spacing w:after="120" w:before="60"/>
+      </w:pPr>
+      <w:r>
+        <w:rPr>
+          <w:rFonts w:ascii="Arial" w:cs="Arial" w:eastAsia="Arial" w:hAnsi="Arial"/>
+          <w:sz w:val="22"/>
+          <w:szCs w:val="22"/>
+        </w:rPr>
+        <w:t xml:space="preserve">Recommendation: All new pages must use the shared components in app/components/destination/. Migrate local implementations to the shared versions in priority order: FAQ → ScenarioCard → Hero. Rename the “FAQAccordian” typo folders to “FAQAccordion” when migrating.</w:t>
+      </w:r>
+    </w:p>
+    <w:p>
+      <w:pPr>
+        <w:spacing w:after="120" w:before="60"/>
+      </w:pPr>
+      <w:r>
+        <w:rPr>
+          <w:rFonts w:ascii="Arial" w:cs="Arial" w:eastAsia="Arial" w:hAnsi="Arial"/>
+          <w:b/>
+          <w:sz w:val="22"/>
+          <w:szCs w:val="22"/>
+        </w:rPr>
+        <w:t xml:space="preserve">Note on ‘use client’ count: </w:t>
+      </w:r>
+      <w:r>
+        <w:rPr>
+          <w:rFonts w:ascii="Arial" w:cs="Arial" w:eastAsia="Arial" w:hAnsi="Arial"/>
+          <w:sz w:val="22"/>
+          <w:szCs w:val="22"/>
+        </w:rPr>
+        <w:t xml:space="preserve">This report was written when the count stood at 77. As of June 14, 2026 the count has grown to 100 “use client” files. The recommendation in section 1.1 applies with greater urgency.</w:t>
+      </w:r>
+    </w:p>
+    <w:p>
+      <w:pPr>
+        <w:pStyle w:val="Heading1"/>
+        <w:pageBreakBefore/>
+      </w:pPr>
+      <w:r>
+        <w:t>7. Affiliate &amp; Monetisation Strategy</w:t>
+      </w:r>
+    </w:p>
+    <w:p>
+      <w:pPr>
+        <w:spacing w:after="120" w:before="60"/>
+      </w:pPr>
+      <w:r>
+        <w:rPr>
+          <w:rFonts w:ascii="Arial" w:cs="Arial" w:eastAsia="Arial" w:hAnsi="Arial"/>
+          <w:sz w:val="22"/>
+          <w:szCs w:val="22"/>
+        </w:rPr>
+        <w:t xml:space="preserve">Booking.com’s Affiliate Program is technically free with no published traffic minimum, but new-site applications are rejected without demonstrated traffic and content. Items below remain open from the May 2026 review.</w:t>
+      </w:r>
+    </w:p>
+    <w:p>
+      <w:pPr>
+        <w:pStyle w:val="Heading2"/>
+      </w:pPr>
+      <w:r>
+        <w:t>7.1 Affiliate Programs to Join Now (low barrier)</w:t>
+      </w:r>
+    </w:p>
+    <w:p>
+      <w:pPr>
+        <w:spacing w:after="80" w:before="60"/>
+      </w:pPr>
+      <w:r>
+        <w:rPr>
+          <w:rFonts w:ascii="Arial" w:cs="Arial" w:eastAsia="Arial" w:hAnsi="Arial"/>
+          <w:sz w:val="22"/>
+          <w:szCs w:val="22"/>
+        </w:rPr>
+        <w:t>These accept new sites and can be live within days:</w:t>
+      </w:r>
+    </w:p>
+    <w:tbl>
+      <w:tblPr>
+        <w:tblStyle w:val="TableGrid"/>
+        <w:tblW w:w="9360" w:type="dxa"/>
+        <w:tblBorders>
+          <w:top w:val="single" w:sz="4" w:color="CCCCCC"/>
+          <w:left w:val="single" w:sz="4" w:color="CCCCCC"/>
+          <w:bottom w:val="single" w:sz="4" w:color="CCCCCC"/>
+          <w:right w:val="single" w:sz="4" w:color="CCCCCC"/>
+          <w:insideH w:val="single" w:sz="4" w:color="CCCCCC"/>
+          <w:insideV w:val="single" w:sz="4" w:color="CCCCCC"/>
+        </w:tblBorders>
+        <w:tblCellMar>
+          <w:top w:w="80" w:type="dxa"/>
+          <w:left w:w="120" w:type="dxa"/>
+          <w:bottom w:w="80" w:type="dxa"/>
+          <w:right w:w="120" w:type="dxa"/>
+        </w:tblCellMar>
+      </w:tblPr>
+      <w:tblGrid>
+        <w:gridCol w:w="2500"/>
+        <w:gridCol w:w="4360"/>
+        <w:gridCol w:w="2500"/>
+      </w:tblGrid>
+      <w:tr>
+        <w:tc>
+          <w:tcPr>
+            <w:tcW w:w="2500" w:type="dxa"/>
+            <w:shd w:val="clear" w:fill="1F3864"/>
+          </w:tcPr>
+          <w:p>
+            <w:r>
+              <w:rPr>
+                <w:rFonts w:ascii="Arial" w:cs="Arial" w:hAnsi="Arial"/>
+                <w:b/>
+                <w:color w:val="FFFFFF"/>
+                <w:sz w:val="20"/>
+              </w:rPr>
+              <w:t>Program</w:t>
+            </w:r>
+          </w:p>
+        </w:tc>
+        <w:tc>
+          <w:tcPr>
+            <w:tcW w:w="4360" w:type="dxa"/>
+            <w:shd w:val="clear" w:fill="1F3864"/>
+          </w:tcPr>
+          <w:p>
+            <w:r>
+              <w:rPr>
+                <w:rFonts w:ascii="Arial" w:cs="Arial" w:hAnsi="Arial"/>
+                <w:b/>
+                <w:color w:val="FFFFFF"/>
+                <w:sz w:val="20"/>
+              </w:rPr>
+              <w:t>Best for</w:t>
+            </w:r>
+          </w:p>
+        </w:tc>
+        <w:tc>
+          <w:tcPr>
+            <w:tcW w:w="2500" w:type="dxa"/>
+            <w:shd w:val="clear" w:fill="1F3864"/>
+          </w:tcPr>
+          <w:p>
+            <w:r>
+              <w:rPr>
+                <w:rFonts w:ascii="Arial" w:cs="Arial" w:hAnsi="Arial"/>
+                <w:b/>
+                <w:color w:val="FFFFFF"/>
+                <w:sz w:val="20"/>
+              </w:rPr>
+              <w:t>Approval bar</w:t>
+            </w:r>
+          </w:p>
+        </w:tc>
+      </w:tr>
+      <w:tr>
+        <w:tc>
+          <w:tcPr>
+            <w:tcW w:w="2500" w:type="dxa"/>
+            <w:shd w:val="clear" w:fill="EEF2F7"/>
+          </w:tcPr>
+          <w:p>
+            <w:r>
+              <w:rPr>
+                <w:rFonts w:ascii="Arial" w:cs="Arial" w:hAnsi="Arial"/>
+                <w:b/>
+                <w:sz w:val="20"/>
+              </w:rPr>
+              <w:t>Travelpayouts</w:t>
+            </w:r>
+          </w:p>
+        </w:tc>
+        <w:tc>
+          <w:tcPr>
+            <w:tcW w:w="4360" w:type="dxa"/>
+            <w:shd w:val="clear" w:fill="EEF2F7"/>
+          </w:tcPr>
+          <w:p>
+            <w:r>
+              <w:rPr>
+                <w:rFonts w:ascii="Arial" w:cs="Arial" w:hAnsi="Arial"/>
+                <w:sz w:val="20"/>
+              </w:rPr>
+              <w:t>Flights (Aviasales), hotels, insurance</w:t>
+            </w:r>
+          </w:p>
+        </w:tc>
+        <w:tc>
+          <w:tcPr>
+            <w:tcW w:w="2500" w:type="dxa"/>
+            <w:shd w:val="clear" w:fill="EEF2F7"/>
+          </w:tcPr>
+          <w:p>
+            <w:r>
+              <w:rPr>
+                <w:rFonts w:ascii="Arial" w:cs="Arial" w:hAnsi="Arial"/>
+                <w:sz w:val="20"/>
+              </w:rPr>
+              <w:t>Low — most new sites approved</w:t>
+            </w:r>
+          </w:p>
+        </w:tc>
+      </w:tr>
+      <w:tr>
+        <w:tc>
+          <w:tcPr>
+            <w:tcW w:w="2500" w:type="dxa"/>
+          </w:tcPr>
+          <w:p>
+            <w:r>
+              <w:rPr>
+                <w:rFonts w:ascii="Arial" w:cs="Arial" w:hAnsi="Arial"/>
+                <w:b/>
+                <w:sz w:val="20"/>
+              </w:rPr>
+              <w:t>Stay22</w:t>
+            </w:r>
+          </w:p>
+        </w:tc>
+        <w:tc>
+          <w:tcPr>
+            <w:tcW w:w="4360" w:type="dxa"/>
+          </w:tcPr>
+          <w:p>
+            <w:r>
+              <w:rPr>
+                <w:rFonts w:ascii="Arial" w:cs="Arial" w:hAnsi="Arial"/>
+                <w:sz w:val="20"/>
+              </w:rPr>
+              <w:t>Auto-monetise hotel mentions; smart OTA redirect</w:t>
+            </w:r>
+          </w:p>
+        </w:tc>
+        <w:tc>
+          <w:tcPr>
+            <w:tcW w:w="2500" w:type="dxa"/>
+          </w:tcPr>
+          <w:p>
+            <w:r>
+              <w:rPr>
+                <w:rFonts w:ascii="Arial" w:cs="Arial" w:hAnsi="Arial"/>
+                <w:sz w:val="20"/>
+              </w:rPr>
+              <w:t>Very low — JS snippet install</w:t>
+            </w:r>
+          </w:p>
+        </w:tc>
+      </w:tr>
+      <w:tr>
+        <w:tc>
+          <w:tcPr>
+            <w:tcW w:w="2500" w:type="dxa"/>
+            <w:shd w:val="clear" w:fill="EEF2F7"/>
+          </w:tcPr>
+          <w:p>
+            <w:r>
+              <w:rPr>
+                <w:rFonts w:ascii="Arial" w:cs="Arial" w:hAnsi="Arial"/>
+                <w:b/>
+                <w:sz w:val="20"/>
+              </w:rPr>
+              <w:t>GetYourGuide / Viator</w:t>
+            </w:r>
+          </w:p>
+        </w:tc>
+        <w:tc>
+          <w:tcPr>
+            <w:tcW w:w="4360" w:type="dxa"/>
+            <w:shd w:val="clear" w:fill="EEF2F7"/>
+          </w:tcPr>
+          <w:p>
+            <w:r>
+              <w:rPr>
+                <w:rFonts w:ascii="Arial" w:cs="Arial" w:hAnsi="Arial"/>
+                <w:sz w:val="20"/>
+              </w:rPr>
+              <w:t>Tours, activities, attractions — fits safety/itinerary content</w:t>
+            </w:r>
+          </w:p>
+        </w:tc>
+        <w:tc>
+          <w:tcPr>
+            <w:tcW w:w="2500" w:type="dxa"/>
+            <w:shd w:val="clear" w:fill="EEF2F7"/>
+          </w:tcPr>
+          <w:p>
+            <w:r>
+              <w:rPr>
+                <w:rFonts w:ascii="Arial" w:cs="Arial" w:hAnsi="Arial"/>
+                <w:sz w:val="20"/>
+              </w:rPr>
+              <w:t>Low</w:t>
+            </w:r>
+          </w:p>
+        </w:tc>
+      </w:tr>
+      <w:tr>
+        <w:tc>
+          <w:tcPr>
+            <w:tcW w:w="2500" w:type="dxa"/>
+          </w:tcPr>
+          <w:p>
+            <w:r>
+              <w:rPr>
+                <w:rFonts w:ascii="Arial" w:cs="Arial" w:hAnsi="Arial"/>
+                <w:b/>
+                <w:sz w:val="20"/>
+              </w:rPr>
+              <w:t>Trip.com Affiliate</w:t>
+            </w:r>
+          </w:p>
+        </w:tc>
+        <w:tc>
+          <w:tcPr>
+            <w:tcW w:w="4360" w:type="dxa"/>
+          </w:tcPr>
+          <w:p>
+            <w:r>
+              <w:rPr>
+                <w:rFonts w:ascii="Arial" w:cs="Arial" w:hAnsi="Arial"/>
+                <w:sz w:val="20"/>
+              </w:rPr>
+              <w:t>Hotels + flights, broad coverage</w:t>
+            </w:r>
+          </w:p>
+        </w:tc>
+        <w:tc>
+          <w:tcPr>
+            <w:tcW w:w="2500" w:type="dxa"/>
+          </w:tcPr>
+          <w:p>
+            <w:r>
+              <w:rPr>
+                <w:rFonts w:ascii="Arial" w:cs="Arial" w:hAnsi="Arial"/>
+                <w:sz w:val="20"/>
+              </w:rPr>
+              <w:t>Low</w:t>
+            </w:r>
+          </w:p>
+        </w:tc>
+      </w:tr>
+      <w:tr>
+        <w:tc>
+          <w:tcPr>
+            <w:tcW w:w="2500" w:type="dxa"/>
+            <w:shd w:val="clear" w:fill="EEF2F7"/>
+          </w:tcPr>
+          <w:p>
+            <w:r>
+              <w:rPr>
+                <w:rFonts w:ascii="Arial" w:cs="Arial" w:hAnsi="Arial"/>
+                <w:b/>
+                <w:sz w:val="20"/>
+              </w:rPr>
+              <w:t>Booking.com via Awin</w:t>
+            </w:r>
+          </w:p>
+        </w:tc>
+        <w:tc>
+          <w:tcPr>
+            <w:tcW w:w="4360" w:type="dxa"/>
+            <w:shd w:val="clear" w:fill="EEF2F7"/>
+          </w:tcPr>
+          <w:p>
+            <w:r>
+              <w:rPr>
+                <w:rFonts w:ascii="Arial" w:cs="Arial" w:hAnsi="Arial"/>
+                <w:sz w:val="20"/>
+              </w:rPr>
+              <w:t>Alternative path — sometimes easier than direct application</w:t>
+            </w:r>
+          </w:p>
+        </w:tc>
+        <w:tc>
+          <w:tcPr>
+            <w:tcW w:w="2500" w:type="dxa"/>
+            <w:shd w:val="clear" w:fill="EEF2F7"/>
+          </w:tcPr>
+          <w:p>
+            <w:r>
+              <w:rPr>
+                <w:rFonts w:ascii="Arial" w:cs="Arial" w:hAnsi="Arial"/>
+                <w:sz w:val="20"/>
+              </w:rPr>
+              <w:t>Moderate</w:t>
+            </w:r>
+          </w:p>
+        </w:tc>
+      </w:tr>
+    </w:tbl>
+    <w:p>
+      <w:pPr>
+        <w:pStyle w:val="Heading2"/>
+      </w:pPr>
+      <w:r>
+        <w:t>7.2 Booking.com Direct Application Prerequisites</w:t>
+      </w:r>
+    </w:p>
+    <w:p>
+      <w:pPr>
+        <w:spacing w:after="80" w:before="60"/>
+      </w:pPr>
+      <w:r>
+        <w:rPr>
+          <w:rFonts w:ascii="Arial" w:cs="Arial" w:eastAsia="Arial" w:hAnsi="Arial"/>
+          <w:sz w:val="22"/>
+          <w:szCs w:val="22"/>
+        </w:rPr>
+        <w:t>Apply at partners.booking.com once all of the following are met:</w:t>
+      </w:r>
+    </w:p>
+    <w:p>
+      <w:pPr>
+        <w:spacing w:after="60" w:before="40"/>
+        <w:ind w:left="360" w:hanging="180"/>
+      </w:pPr>
+      <w:r>
+        <w:rPr>
+          <w:rFonts w:ascii="Arial" w:cs="Arial" w:hAnsi="Arial"/>
+          <w:sz w:val="22"/>
+          <w:szCs w:val="22"/>
+        </w:rPr>
+        <w:t xml:space="preserve">•  200+ organic clicks/month (Google Search Console)</w:t>
+      </w:r>
+    </w:p>
+    <w:p>
+      <w:pPr>
+        <w:spacing w:after="60" w:before="40"/>
+        <w:ind w:left="360" w:hanging="180"/>
+      </w:pPr>
+      <w:r>
+        <w:rPr>
+          <w:rFonts w:ascii="Arial" w:cs="Arial" w:hAnsi="Arial"/>
+          <w:sz w:val="22"/>
+          <w:szCs w:val="22"/>
+        </w:rPr>
+        <w:t xml:space="preserve">•  50+ pages indexed in Google</w:t>
+      </w:r>
+    </w:p>
+    <w:p>
+      <w:pPr>
+        <w:spacing w:after="60" w:before="40"/>
+        <w:ind w:left="360" w:hanging="180"/>
+      </w:pPr>
+      <w:r>
+        <w:rPr>
+          <w:rFonts w:ascii="Arial" w:cs="Arial" w:hAnsi="Arial"/>
+          <w:sz w:val="22"/>
+          <w:szCs w:val="22"/>
+        </w:rPr>
+        <w:t xml:space="preserve">•  5+ referring domains (backlinks)</w:t>
+      </w:r>
+    </w:p>
+    <w:p>
+      <w:pPr>
+        <w:spacing w:after="60" w:before="40"/>
+        <w:ind w:left="360" w:hanging="180"/>
+      </w:pPr>
+      <w:r>
+        <w:rPr>
+          <w:rFonts w:ascii="Arial" w:cs="Arial" w:hAnsi="Arial"/>
+          <w:sz w:val="22"/>
+          <w:szCs w:val="22"/>
+        </w:rPr>
+        <w:t xml:space="preserve">•  Email list (any size &gt; 50 — shows audience beyond search)</w:t>
+      </w:r>
+    </w:p>
+    <w:p>
+      <w:pPr>
+        <w:spacing w:after="60" w:before="40"/>
+        <w:ind w:left="360" w:hanging="180"/>
+      </w:pPr>
+      <w:r>
+        <w:rPr>
+          <w:rFonts w:ascii="Arial" w:cs="Arial" w:hAnsi="Arial"/>
+          <w:sz w:val="22"/>
+          <w:szCs w:val="22"/>
+        </w:rPr>
+        <w:t xml:space="preserve">•  Affiliate disclosure on every page with outbound affiliate links</w:t>
+      </w:r>
+    </w:p>
+    <w:p>
+      <w:pPr>
+        <w:spacing w:after="60" w:before="40"/>
+        <w:ind w:left="360" w:hanging="180"/>
+      </w:pPr>
+      <w:r>
+        <w:rPr>
+          <w:rFonts w:ascii="Arial" w:cs="Arial" w:hAnsi="Arial"/>
+          <w:sz w:val="22"/>
+          <w:szCs w:val="22"/>
+        </w:rPr>
+        <w:t xml:space="preserve">•  “About” page with real bio, named author, and contact form</w:t>
+      </w:r>
+    </w:p>
+    <w:p>
+      <w:pPr>
+        <w:spacing w:after="120" w:before="60"/>
+      </w:pPr>
+      <w:r>
+        <w:rPr>
+          <w:rFonts w:ascii="Arial" w:cs="Arial" w:eastAsia="Arial" w:hAnsi="Arial"/>
+          <w:sz w:val="22"/>
+          <w:szCs w:val="22"/>
+        </w:rPr>
+        <w:t xml:space="preserve">Apply via Awin simultaneously as a parallel path — the review process is sometimes less stringent than the direct partner portal.</w:t>
+      </w:r>
+    </w:p>
+    <w:p>
+      <w:pPr>
+        <w:spacing w:after="60" w:before="60"/>
+      </w:pPr>
+      <w:r>
+        <w:rPr>
+          <w:rFonts w:ascii="Arial" w:cs="Arial" w:eastAsia="Arial" w:hAnsi="Arial"/>
+          <w:i/>
+          <w:iCs/>
+          <w:color w:val="666666"/>
+          <w:sz w:val="20"/>
+          <w:szCs w:val="20"/>
+        </w:rPr>
+        <w:t xml:space="preserve">Sections 6–7 consolidated from deep-repo-review.md (May 25 2026) and code-review-and-90-day-plan.md (May 24 2026). Both source files deleted after merge.</w:t>
+      </w:r>
     </w:p>
     <w:p>
       <w:pPr>

</xml_diff>